<commit_message>
Fanfic: full continuity/voice/plot review — ~150 fixes across all 30 chapters, rebuilt outputs
Co-Authored-By: Claude Opus 5.5 <noreply@anthropic.com>
Claude-Session: https://claude.ai/code/session_01Sd9MuWDWtGoT875c3gotvE
</commit_message>
<xml_diff>
--- a/fanfic/ffn_upload/ch01.docx
+++ b/fanfic/ffn_upload/ch01.docx
@@ -94,7 +94,7 @@
         <w:pStyle w:val="BodyText"/>
       </w:pPr>
       <w:r>
-        <w:t xml:space="preserve">He had fought Asajj Ventress more times than he could count. On Yavin. On Tatooine. In the dark, on ships, in places he didn’t like to remember. Her presence in the Force had always felt to him like a bruise that had gone cold, an ache you could locate with your eyes shut. It was faint now, fainter than he’d ever felt it. She was hurt. She was trying to be small.</w:t>
+        <w:t xml:space="preserve">He had fought Asajj Ventress more times than he could count. On Teth. On Kamino. In the dark, on ships, in places he didn’t like to remember. Her presence in the Force had always felt to him like a bruise that had gone cold, an ache you could locate with your eyes shut. It was faint now, fainter than he’d ever felt it. She was hurt. She was trying to be small.</w:t>
       </w:r>
     </w:p>
     <w:p>
@@ -125,7 +125,7 @@
         <w:pStyle w:val="FirstParagraph"/>
       </w:pPr>
       <w:r>
-        <w:t xml:space="preserve">The maintenance gallery hung over the Dovrin Line transit platform like a balcony nobody was supposed to stand on. It was a narrow lattice of grating and old cable runs, strung between the support pylons that held up a hab stack twenty storeys tall, a whole crooked tower of apartments bolted to the underside of the level above. Through the grating, Anakin could see the platform below: a long slab of ferrocrete under flickering signal lights, and more people than he would have expected at this hour. Shift workers. Haulers. A Gran woman with a sleeping child on her shoulder. A pair of loader droids arguing in binary about a crate.</w:t>
+        <w:t xml:space="preserve">The maintenance gallery hung over the Dovrin Line transit platform like a balcony nobody was supposed to stand on. It was a narrow lattice of grating and old cable runs, strung between the support pylons that held up a hab stack twenty stories tall, a whole crooked tower of apartments bolted to the underside of the level above. Through the grating, Anakin could see the platform below: a long slab of ferrocrete under flickering signal lights, and more people than he would have expected at this hour. Shift workers. Haulers. A Gran woman with a sleeping child on her shoulder. A pair of loader droids arguing in binary about a crate.</w:t>
       </w:r>
     </w:p>
     <w:p>
@@ -731,7 +731,7 @@
         <w:pStyle w:val="BodyText"/>
       </w:pPr>
       <w:r>
-        <w:t xml:space="preserve">The figure gave ground, but it gave it the way water gives. Each of his blows met a blade that was already there. Circles, tight and closed and patient, both red sabers turning in short economical arcs that never wasted a centimetre, never reached, never showed off. It didn’t fight like Ventress. Ventress fought like a storm, all flourish and fury. This was something else.</w:t>
+        <w:t xml:space="preserve">The figure gave ground, but it gave it the way water gives. Each of his blows met a blade that was already there. Circles, tight and closed and patient, both red sabers turning in short economical arcs that never wasted a centimeter, never reached, never showed off. It didn’t fight like Ventress. Ventress fought like a storm, all flourish and fury. This was something else.</w:t>
       </w:r>
     </w:p>
     <w:p>
@@ -867,7 +867,7 @@
         <w:pStyle w:val="FirstParagraph"/>
       </w:pPr>
       <w:r>
-        <w:t xml:space="preserve">It went down, not up. That surprised him. It vaulted the railing on the platform side and dropped three storeys onto the roof of a stalled transit car, rolled, and came up sprinting along the car’s spine toward the far end of the platform.</w:t>
+        <w:t xml:space="preserve">It went down, not up. That surprised him. It vaulted the railing on the platform side and dropped three stories onto the roof of a stalled transit car, rolled, and came up sprinting along the car’s spine toward the far end of the platform.</w:t>
       </w:r>
     </w:p>
     <w:p>
@@ -977,15 +977,15 @@
         <w:pStyle w:val="BodyText"/>
       </w:pPr>
       <w:r>
-        <w:t xml:space="preserve">Above the platform, twenty storeys of hab stack began to lean.</w:t>
-      </w:r>
-    </w:p>
-    <w:p>
-      <w:pPr>
-        <w:pStyle w:val="BodyText"/>
-      </w:pPr>
-      <w:r>
-        <w:t xml:space="preserve">It came slowly at first. A few bolts sheared off the ceiling with sharp cracks like blasterfire, and dust and old paint rained down across the crowd. Then a balcony tore loose from the third level of the stack and fell, and hit the ferrocrete twenty metres from the Gran woman and her child, and the whole platform began to scream.</w:t>
+        <w:t xml:space="preserve">Above the platform, twenty stories of hab stack began to lean.</w:t>
+      </w:r>
+    </w:p>
+    <w:p>
+      <w:pPr>
+        <w:pStyle w:val="BodyText"/>
+      </w:pPr>
+      <w:r>
+        <w:t xml:space="preserve">It came slowly at first. A few bolts sheared off the ceiling with sharp cracks like blasterfire, and dust and old paint rained down across the crowd. Then a balcony tore loose from the third level of the stack and fell, and hit the ferrocrete twenty meters from the Gran woman and her child, and the whole platform began to scream.</w:t>
       </w:r>
     </w:p>
     <w:p>
@@ -1075,7 +1075,7 @@
         <w:pStyle w:val="BodyText"/>
       </w:pPr>
       <w:r>
-        <w:t xml:space="preserve">He had held up a great many things in his life. Ships. Walls. A gunship’s weight on Christophsis while Rex’s men climbed out of it. He had never held up anything like this. The Force came to him in a rush, and he flung it upward and</w:t>
+        <w:t xml:space="preserve">He had held up a great many things in his life. Ships. Walls. A gunship’s weight, once, while Rex’s men climbed out of it. He had never held up anything like this. The Force came to him in a rush, and he flung it upward and</w:t>
       </w:r>
       <w:r>
         <w:t xml:space="preserve"> </w:t>
@@ -1169,7 +1169,7 @@
         <w:pStyle w:val="BodyText"/>
       </w:pPr>
       <w:r>
-        <w:t xml:space="preserve">The weight shifted. Something inside the stack gave, a floor dropping onto the floor below, and the whole tower slid half a metre toward him. He dropped to one knee. Blood was running warm out of his nose and over his lip. He could taste it.</w:t>
+        <w:t xml:space="preserve">The weight shifted. Something inside the stack gave, a floor dropping onto the floor below, and the whole tower slid half a meter toward him. He dropped to one knee. Blood was running warm out of his nose and over his lip. He could taste it.</w:t>
       </w:r>
     </w:p>
     <w:p>
@@ -1197,7 +1197,7 @@
         <w:pStyle w:val="BodyText"/>
       </w:pPr>
       <w:r>
-        <w:t xml:space="preserve">When the last of them had cleared the stairs, a pair of dock workers who turned at the bottom to stare up at him, he found the empty end of the platform with his mind. He began to let the stack down. Slowly. A centimetre at a time. Easing it away from the remaining pylons and onto the bare ferrocrete where no one stood, letting each floor settle onto the one below it with long groaning crunches that shook the platform under his knee.</w:t>
+        <w:t xml:space="preserve">When the last of them had cleared the stairs, a pair of dock workers who turned at the bottom to stare up at him, he found the empty end of the platform with his mind. He began to let the stack down. Slowly. A centimeter at a time. Easing it away from the remaining pylons and onto the bare ferrocrete where no one stood, letting each floor settle onto the one below it with long groaning crunches that shook the platform under his knee.</w:t>
       </w:r>
     </w:p>
     <w:p>
@@ -1865,7 +1865,7 @@
         <w:pStyle w:val="FirstParagraph"/>
       </w:pPr>
       <w:r>
-        <w:t xml:space="preserve">Three levels up and half a kilometre east, in an alley that smelled of hot grease and wet stone, Barriss Offee stopped running because her legs would not let her run any further.</w:t>
+        <w:t xml:space="preserve">Three levels up and half a kilometer east, in an alley that smelled of hot grease and wet stone, Barriss Offee stopped running because her legs would not let her run any further.</w:t>
       </w:r>
     </w:p>
     <w:p>
@@ -1929,7 +1929,7 @@
         <w:pStyle w:val="BodyText"/>
       </w:pPr>
       <w:r>
-        <w:t xml:space="preserve">She should not have used them on Ventress. She should not have needed to. The woman had been sitting in the open, talking, and Barriss had crouched in the cables above her and listened to her talk about the warehouse and about who had known where to wait, and had understood exactly where that sentence ended. With a name. With a holo-call to a friend in the Temple, made by a frightened girl in the dark who had trusted the one person she shouldn’t.</w:t>
+        <w:t xml:space="preserve">She should not have used them on Ventress. She should not have needed to. She had only meant to see where Skywalker was going when she watched him leave the Temple alone after dark, and she had followed him down, level by level, to the one person in the lower city who could still put a name to the warehouse. The woman had been sitting in the open, talking, and Barriss had crouched in the cables above her and listened to her talk about the warehouse and about who had known where to wait, and had understood exactly where that sentence ended. With a name. With a comlink call to a friend in the Temple, made by a frightened girl in the dark who had trusted the one person she shouldn’t.</w:t>
       </w:r>
     </w:p>
     <w:p>
@@ -2011,7 +2011,7 @@
         <w:t xml:space="preserve"> </w:t>
       </w:r>
       <w:r>
-        <w:t xml:space="preserve">down to her bones, that he would choose the people over her. Because whatever the Order had made of the rest of them, there was still that much Jedi left in him. She had wagered twenty storeys of sleeping strangers on the goodness of a man she was trying to destroy the student of.</w:t>
+        <w:t xml:space="preserve">down to her bones, that he would choose the people over her. Because whatever the Order had made of the rest of them, there was still that much Jedi left in him. She had wagered twenty stories of sleeping strangers on the goodness of a man whose student she was trying to destroy.</w:t>
       </w:r>
     </w:p>
     <w:p>
@@ -2115,7 +2115,7 @@
         <w:pStyle w:val="BodyText"/>
       </w:pPr>
       <w:r>
-        <w:t xml:space="preserve">She pulled up her hood and walked out of the alley, toward the lift banks that would carry her up and up, through six hundred levels of light, to the Temple. There were memorial candles in the Hall of Remembrance for the dead of the hangar bombing. She had lit one every morning since it happened. She would light one this morning too.</w:t>
+        <w:t xml:space="preserve">She pulled up her hood and walked out of the alley, toward the lift banks that would carry her up and up, through six hundred levels of light, to the Temple. There were memorial candles in an alcove above the rebuilt hangar for the dead of the bombing. She had lit one every morning since it happened. She would light one this morning too.</w:t>
       </w:r>
     </w:p>
     <w:p>

</xml_diff>